<commit_message>
Update UI design document
</commit_message>
<xml_diff>
--- a/RSVPApp/UIDesignDoc.docx
+++ b/RSVPApp/UIDesignDoc.docx
@@ -71,22 +71,115 @@
     </w:p>
     <w:p>
       <w:r>
+        <w:t xml:space="preserve">Data includes Id, Title, Description, </w:t>
+      </w:r>
+      <w:proofErr w:type="spellStart"/>
+      <w:r>
+        <w:t>EventDateTime</w:t>
+      </w:r>
+      <w:proofErr w:type="spellEnd"/>
+      <w:r>
+        <w:t xml:space="preserve">, Location, </w:t>
+      </w:r>
+      <w:proofErr w:type="spellStart"/>
+      <w:r>
+        <w:t>HostUserId</w:t>
+      </w:r>
+      <w:proofErr w:type="spellEnd"/>
+      <w:r>
+        <w:t xml:space="preserve">, </w:t>
+      </w:r>
+      <w:proofErr w:type="spellStart"/>
+      <w:r>
+        <w:t>MaxQuests</w:t>
+      </w:r>
+      <w:proofErr w:type="spellEnd"/>
+      <w:r>
+        <w:t xml:space="preserve">, and </w:t>
+      </w:r>
+      <w:proofErr w:type="spellStart"/>
+      <w:r>
+        <w:t>CreatedAtUtc</w:t>
+      </w:r>
+      <w:proofErr w:type="spellEnd"/>
+    </w:p>
+    <w:p>
+      <w:r>
+        <w:t>Rsvp</w:t>
+      </w:r>
+    </w:p>
+    <w:p>
+      <w:r>
+        <w:t>Represents one RSVP submission for one event</w:t>
+      </w:r>
+    </w:p>
+    <w:p>
+      <w:r>
+        <w:t xml:space="preserve">Data includes Id, </w:t>
+      </w:r>
+      <w:proofErr w:type="spellStart"/>
+      <w:r>
+        <w:t>EventId</w:t>
+      </w:r>
+      <w:proofErr w:type="spellEnd"/>
+      <w:r>
+        <w:t xml:space="preserve">, </w:t>
+      </w:r>
+      <w:proofErr w:type="spellStart"/>
+      <w:r>
+        <w:t>UserId</w:t>
+      </w:r>
+      <w:proofErr w:type="spellEnd"/>
+      <w:r>
+        <w:t xml:space="preserve">, </w:t>
+      </w:r>
+      <w:proofErr w:type="spellStart"/>
+      <w:r>
+        <w:t>AttendeeName</w:t>
+      </w:r>
+      <w:proofErr w:type="spellEnd"/>
+      <w:r>
+        <w:t xml:space="preserve">, </w:t>
+      </w:r>
+      <w:proofErr w:type="spellStart"/>
+      <w:r>
+        <w:t>AttendeeEmail</w:t>
+      </w:r>
+      <w:proofErr w:type="spellEnd"/>
+      <w:r>
+        <w:t xml:space="preserve">, </w:t>
+      </w:r>
+      <w:proofErr w:type="spellStart"/>
+      <w:r>
+        <w:t>GuestCount</w:t>
+      </w:r>
+      <w:proofErr w:type="spellEnd"/>
+      <w:r>
+        <w:t xml:space="preserve">, Status, Notes, and </w:t>
+      </w:r>
+      <w:proofErr w:type="spellStart"/>
+      <w:r>
+        <w:t>CreatedAtUtc</w:t>
+      </w:r>
+      <w:proofErr w:type="spellEnd"/>
+    </w:p>
+    <w:p>
+      <w:r>
+        <w:t>AppSession</w:t>
+      </w:r>
+    </w:p>
+    <w:p>
+      <w:r>
+        <w:t>Tracks who is currently using the app</w:t>
+      </w:r>
+    </w:p>
+    <w:p>
+      <w:r>
         <w:t xml:space="preserve">Data includes </w:t>
       </w:r>
-      <w:r>
-        <w:t xml:space="preserve">Id, Title, Description, </w:t>
-      </w:r>
-      <w:proofErr w:type="spellStart"/>
-      <w:r>
-        <w:t>EventDateTime</w:t>
-      </w:r>
-      <w:proofErr w:type="spellEnd"/>
-      <w:r>
-        <w:t xml:space="preserve">, Location, </w:t>
-      </w:r>
-      <w:proofErr w:type="spellStart"/>
-      <w:r>
-        <w:t>HostUserId</w:t>
+      <w:proofErr w:type="spellStart"/>
+      <w:r>
+        <w:t>CurrentUserId</w:t>
       </w:r>
       <w:proofErr w:type="spellEnd"/>
       <w:r>
@@ -94,7 +187,7 @@
       </w:r>
       <w:proofErr w:type="spellStart"/>
       <w:r>
-        <w:t>MaxQuests</w:t>
+        <w:t>IsGuestSession</w:t>
       </w:r>
       <w:proofErr w:type="spellEnd"/>
       <w:r>
@@ -102,103 +195,9 @@
       </w:r>
       <w:proofErr w:type="spellStart"/>
       <w:r>
-        <w:t>CreatedAtUtc</w:t>
-      </w:r>
-      <w:proofErr w:type="spellEnd"/>
-    </w:p>
-    <w:p>
-      <w:r>
-        <w:t>Rsvp</w:t>
-      </w:r>
-    </w:p>
-    <w:p>
-      <w:r>
-        <w:t>Represents one RSVP submission for one event</w:t>
-      </w:r>
-    </w:p>
-    <w:p>
-      <w:r>
-        <w:t xml:space="preserve">Data includes </w:t>
-      </w:r>
-      <w:r>
-        <w:t xml:space="preserve">Id, </w:t>
-      </w:r>
-      <w:proofErr w:type="spellStart"/>
-      <w:r>
-        <w:t>EventId</w:t>
-      </w:r>
-      <w:proofErr w:type="spellEnd"/>
-      <w:r>
-        <w:t xml:space="preserve">, </w:t>
-      </w:r>
-      <w:proofErr w:type="spellStart"/>
-      <w:r>
-        <w:t>UserId</w:t>
-      </w:r>
-      <w:proofErr w:type="spellEnd"/>
-      <w:r>
-        <w:t xml:space="preserve">, </w:t>
-      </w:r>
-      <w:proofErr w:type="spellStart"/>
-      <w:r>
-        <w:t>AttendeeName</w:t>
-      </w:r>
-      <w:proofErr w:type="spellEnd"/>
-      <w:r>
-        <w:t xml:space="preserve">, </w:t>
-      </w:r>
-      <w:proofErr w:type="spellStart"/>
-      <w:r>
-        <w:t>AttendeeEmail</w:t>
-      </w:r>
-      <w:proofErr w:type="spellEnd"/>
-      <w:r>
-        <w:t xml:space="preserve">, </w:t>
-      </w:r>
-      <w:proofErr w:type="spellStart"/>
-      <w:r>
-        <w:t>GuestCount</w:t>
-      </w:r>
-      <w:proofErr w:type="spellEnd"/>
-      <w:r>
-        <w:t xml:space="preserve">, Status, Notes, and </w:t>
-      </w:r>
-      <w:proofErr w:type="spellStart"/>
-      <w:r>
-        <w:t>CreatedAtUtc</w:t>
-      </w:r>
-      <w:proofErr w:type="spellEnd"/>
-    </w:p>
-    <w:p>
-      <w:r>
-        <w:t>AppSession</w:t>
-      </w:r>
-    </w:p>
-    <w:p>
-      <w:r>
-        <w:t>Tracks who is currently using the app</w:t>
-      </w:r>
-    </w:p>
-    <w:p>
-      <w:r>
-        <w:t xml:space="preserve">Data includes </w:t>
-      </w:r>
-      <w:proofErr w:type="spellStart"/>
-      <w:r>
-        <w:t>CurrentUserId</w:t>
-      </w:r>
-      <w:proofErr w:type="spellEnd"/>
-      <w:r>
-        <w:t xml:space="preserve">, </w:t>
-      </w:r>
-      <w:proofErr w:type="spellStart"/>
-      <w:r>
-        <w:t>IsGuestSession</w:t>
-      </w:r>
-      <w:proofErr w:type="spellEnd"/>
-      <w:r>
-        <w:t>, and SessionStartedUtc</w:t>
-      </w:r>
+        <w:t>SessionStartedUtc</w:t>
+      </w:r>
+      <w:proofErr w:type="spellEnd"/>
     </w:p>
     <w:p>
       <w:pPr>
@@ -345,6 +344,64 @@
         <w:t>AttendeeEmail</w:t>
       </w:r>
       <w:proofErr w:type="spellEnd"/>
+    </w:p>
+    <w:p/>
+    <w:p>
+      <w:pPr>
+        <w:rPr>
+          <w:b/>
+          <w:bCs/>
+        </w:rPr>
+      </w:pPr>
+      <w:r>
+        <w:rPr>
+          <w:b/>
+          <w:bCs/>
+        </w:rPr>
+        <w:t>User can log into the app with:</w:t>
+      </w:r>
+      <w:r>
+        <w:rPr>
+          <w:b/>
+          <w:bCs/>
+        </w:rPr>
+        <w:br/>
+      </w:r>
+      <w:r>
+        <w:rPr>
+          <w:b/>
+          <w:bCs/>
+        </w:rPr>
+        <w:br/>
+      </w:r>
+      <w:r>
+        <w:t>Username:</w:t>
+      </w:r>
+      <w:r>
+        <w:rPr>
+          <w:b/>
+          <w:bCs/>
+        </w:rPr>
+        <w:t xml:space="preserve"> student</w:t>
+      </w:r>
+    </w:p>
+    <w:p>
+      <w:pPr>
+        <w:rPr>
+          <w:b/>
+          <w:bCs/>
+        </w:rPr>
+      </w:pPr>
+      <w:r>
+        <w:t>Password:</w:t>
+      </w:r>
+      <w:r>
+        <w:rPr>
+          <w:b/>
+          <w:bCs/>
+        </w:rPr>
+        <w:t xml:space="preserve"> password123</w:t>
+      </w:r>
     </w:p>
     <w:sectPr>
       <w:pgSz w:w="12240" w:h="15840"/>

</xml_diff>